<commit_message>
docs(week1): update discovery report for MFA, Git sync lessons and external access scope
</commit_message>
<xml_diff>
--- a/labs/week1/Discovery Report - Automating Secure Onboarding at Scale.docx
+++ b/labs/week1/Discovery Report - Automating Secure Onboarding at Scale.docx
@@ -1743,6 +1743,83 @@
           </w:tcPr>
           <w:p>
             <w:r>
+              <w:t xml:space="preserve">AWS IAM: MFA requirement</w:t>
+            </w:r>
+          </w:p>
+        </w:tc>
+        <w:tc>
+          <w:tcPr>
+            <w:tcW w:w="3200" w:type="dxa"/>
+            <w:tcBorders>
+              <w:top w:val="single" w:sz="4" w:space="0" w:color="BFBFBF"/>
+              <w:left w:val="single" w:sz="4" w:space="0" w:color="BFBFBF"/>
+              <w:bottom w:val="single" w:sz="4" w:space="0" w:color="BFBFBF"/>
+              <w:right w:val="single" w:sz="4" w:space="0" w:color="BFBFBF"/>
+            </w:tcBorders>
+            <w:tcMar>
+              <w:top w:w="60" w:type="dxa"/>
+              <w:left w:w="100" w:type="dxa"/>
+              <w:bottom w:w="60" w:type="dxa"/>
+              <w:right w:w="100" w:type="dxa"/>
+            </w:tcMar>
+          </w:tcPr>
+          <w:p>
+            <w:r>
+              <w:t xml:space="preserve">A managed policy on the all-engineers group denies everything until the engineer signs in with MFA, except changing their first password and enrolling their own device.</w:t>
+            </w:r>
+          </w:p>
+        </w:tc>
+        <w:tc>
+          <w:tcPr>
+            <w:tcW w:w="4480" w:type="dxa"/>
+            <w:tcBorders>
+              <w:top w:val="single" w:sz="4" w:space="0" w:color="BFBFBF"/>
+              <w:left w:val="single" w:sz="4" w:space="0" w:color="BFBFBF"/>
+              <w:bottom w:val="single" w:sz="4" w:space="0" w:color="BFBFBF"/>
+              <w:right w:val="single" w:sz="4" w:space="0" w:color="BFBFBF"/>
+            </w:tcBorders>
+            <w:tcMar>
+              <w:top w:w="60" w:type="dxa"/>
+              <w:left w:w="100" w:type="dxa"/>
+              <w:bottom w:w="60" w:type="dxa"/>
+              <w:right w:w="100" w:type="dxa"/>
+            </w:tcMar>
+          </w:tcPr>
+          <w:p>
+            <w:r>
+              <w:t xml:space="preserve">A stolen password alone is useless. CloudFormation can't enrol a phone for someone, so the template requires MFA and each engineer enrols at first sign-in.</w:t>
+            </w:r>
+          </w:p>
+        </w:tc>
+      </w:tr>
+      <w:tr>
+        <w:tblPrEx>
+          <w:tblCellMar>
+            <w:top w:w="0" w:type="dxa"/>
+            <w:bottom w:w="0" w:type="dxa"/>
+          </w:tblCellMar>
+        </w:tblPrEx>
+        <w:trPr>
+          <w:trHeight w:val="700"/>
+        </w:trPr>
+        <w:tc>
+          <w:tcPr>
+            <w:tcW w:w="2400" w:type="dxa"/>
+            <w:tcBorders>
+              <w:top w:val="single" w:sz="4" w:space="0" w:color="BFBFBF"/>
+              <w:left w:val="single" w:sz="4" w:space="0" w:color="BFBFBF"/>
+              <w:bottom w:val="single" w:sz="4" w:space="0" w:color="BFBFBF"/>
+              <w:right w:val="single" w:sz="4" w:space="0" w:color="BFBFBF"/>
+            </w:tcBorders>
+            <w:tcMar>
+              <w:top w:w="60" w:type="dxa"/>
+              <w:left w:w="100" w:type="dxa"/>
+              <w:bottom w:w="60" w:type="dxa"/>
+              <w:right w:w="100" w:type="dxa"/>
+            </w:tcMar>
+          </w:tcPr>
+          <w:p>
+            <w:r>
               <w:t xml:space="preserve">AWS Secrets Manager</w:t>
             </w:r>
           </w:p>
@@ -2645,14 +2722,17 @@
         <w:spacing w:after="80"/>
       </w:pPr>
       <w:r>
+        <w:t xml:space="preserve"/>
+      </w:r>
+      <w:r>
         <w:rPr>
           <w:b/>
           <w:bCs/>
         </w:rPr>
-        <w:t xml:space="preserve">Long-lived passwords.</w:t>
-      </w:r>
-      <w:r>
-        <w:t xml:space="preserve"> IAM users keep passwords until someone rotates them, which falls short of the Client Profile's preference for avoiding long-lived credentials. Multi-factor authentication must be enrolled by each engineer, so it cannot be fully automated in the template. IAM Identity Center is the longer-term fix.</w:t>
+        <w:t xml:space="preserve">Passwords plus MFA, not temporary credentials.</w:t>
+      </w:r>
+      <w:r>
+        <w:t xml:space="preserve"> Engineers sign in as IAM users with passwords. MFA is now required: an engineer can do nothing until they enrol a device, so a stolen password alone is useless. The credentials are still long-lived compared with the temporary sessions of IAM Identity Center, which remains the longer-term fix.</w:t>
       </w:r>
     </w:p>
     <w:p>
@@ -2705,6 +2785,9 @@
         <w:spacing w:after="80"/>
       </w:pPr>
       <w:r>
+        <w:t xml:space="preserve"/>
+      </w:r>
+      <w:r>
         <w:rPr>
           <w:b/>
           <w:bCs/>
@@ -2712,7 +2795,7 @@
         <w:t xml:space="preserve">One-time setup outside the template.</w:t>
       </w:r>
       <w:r>
-        <w:t xml:space="preserve"> The Git sync connection to GitHub is approved once in the console, and the account-wide password policy has no native CloudFormation resource. Both are documented as prerequisites.</w:t>
+        <w:t xml:space="preserve"> AWS requires a person to approve the GitHub connection in the console. It must be approved with the AWS Connector for GitHub app installed, otherwise GitHub never notifies AWS of new commits (I hit this during the build). Git sync can only manage a stack that already exists, so each lab stack starts from an empty placeholder template kept in the repository.</w:t>
       </w:r>
     </w:p>
     <w:p>
@@ -2733,6 +2816,29 @@
       </w:r>
       <w:r>
         <w:t xml:space="preserve"> CloudTrail logs are stored in Ireland, not Africa, because Git sync isn't offered in Cape Town. The logs contain account activity, not customer data, but this should be confirmed against data protection rules in each market.</w:t>
+      </w:r>
+    </w:p>
+    <w:p>
+      <w:pPr>
+        <w:pStyle w:val="ListParagraph"/>
+        <w:numPr>
+          <w:ilvl w:val="0"/>
+          <w:numId w:val="2"/>
+        </w:numPr>
+        <w:spacing w:after="80"/>
+      </w:pPr>
+      <w:r>
+        <w:t xml:space="preserve"/>
+      </w:r>
+      <w:r>
+        <w:rPr>
+          <w:b/>
+          <w:bCs/>
+        </w:rPr>
+        <w:t xml:space="preserve">People outside the company are out of scope.</w:t>
+      </w:r>
+      <w:r>
+        <w:t xml:space="preserve"> The Client Profile's Week 1 needs include temporary, limited access for people outside the company. This lab's brief covers three internal engineers, so external access is not built here. The next step would be an IAM role that contractors assume for a limited time, with its own permissions boundary, instead of giving them IAM users.</w:t>
       </w:r>
     </w:p>
     <w:sectPr>

</xml_diff>